<commit_message>
Entregas: guías de muestra actualizadas
Co-Authored-By: Claude Opus 5.5 <noreply@anthropic.com>
Claude-Session: https://claude.ai/code/session_01GLj1XaXL3zPjkcPgbeyeYx
</commit_message>
<xml_diff>
--- a/entregas/Guía Diseño de investigación.docx
+++ b/entregas/Guía Diseño de investigación.docx
@@ -2965,7 +2965,7 @@
                 <w:sz w:val="26"/>
                 <w:szCs w:val="26"/>
               </w:rPr>
-              <w:t xml:space="preserve"> Mis fuentes (Referencias APA)</w:t>
+              <w:t xml:space="preserve"> Mis fuentes</w:t>
             </w:r>
           </w:p>
           <w:p>
@@ -2979,7 +2979,7 @@
                 <w:sz w:val="18"/>
                 <w:szCs w:val="18"/>
               </w:rPr>
-              <w:t xml:space="preserve">Escribe de dónde sacaste cada cita.</w:t>
+              <w:t xml:space="preserve">¿De dónde sacaste la información? Completa un recuadro por cada cita.</w:t>
             </w:r>
           </w:p>
         </w:tc>
@@ -3014,23 +3014,7 @@
                 <w:sz w:val="18"/>
                 <w:szCs w:val="18"/>
               </w:rPr>
-              <w:t xml:space="preserve">Orden: Autor o institución. (Año). Título. Página web o libro.</w:t>
-            </w:r>
-          </w:p>
-          <w:p>
-            <w:pPr>
-              <w:spacing w:after="60" w:before="40" w:line="276"/>
-            </w:pPr>
-            <w:r>
-              <w:rPr>
-                <w:rFonts w:ascii="Arial" w:cs="Arial" w:eastAsia="Arial" w:hAnsi="Arial"/>
-                <w:i/>
-                <w:iCs/>
-                <w:color w:val="8A6100"/>
-                <w:sz w:val="18"/>
-                <w:szCs w:val="18"/>
-              </w:rPr>
-              <w:t xml:space="preserve">Ejemplo: Ministerio de Salud. (2025). Dengue: síntomas y prevención. gob.pe</w:t>
+              <w:t xml:space="preserve">Ejemplo: Autor o página: Ministerio de Salud · Año: 2025 · Tema: El dengue · Link: https://www.gob.pe/minsa</w:t>
             </w:r>
           </w:p>
           <w:p>
@@ -3062,29 +3046,268 @@
               </w:tblBorders>
             </w:tblPr>
             <w:tblGrid>
-              <w:gridCol w:w="9318"/>
+              <w:gridCol w:w="2400"/>
+              <w:gridCol w:w="6918"/>
             </w:tblGrid>
             <w:tr>
               <w:tc>
                 <w:tcPr>
-                  <w:tcW w:type="dxa" w:w="9318"/>
-                  <w:tcBorders>
-                    <w:top w:val="single" w:color="93C5FD" w:sz="8"/>
-                    <w:left w:val="single" w:color="93C5FD" w:sz="8"/>
-                    <w:bottom w:val="single" w:color="93C5FD" w:sz="8"/>
-                    <w:right w:val="single" w:color="93C5FD" w:sz="8"/>
+                  <w:tcW w:type="dxa" w:w="2400"/>
+                  <w:tcBorders>
+                    <w:top w:val="single" w:color="93C5FD" w:sz="6"/>
+                    <w:left w:val="single" w:color="93C5FD" w:sz="6"/>
+                    <w:bottom w:val="single" w:color="93C5FD" w:sz="6"/>
+                    <w:right w:val="single" w:color="93C5FD" w:sz="6"/>
+                  </w:tcBorders>
+                  <w:shd w:fill="E7F2FA" w:color="auto" w:val="clear"/>
+                  <w:tcMar>
+                    <w:top w:type="dxa" w:w="110"/>
+                    <w:left w:type="dxa" w:w="160"/>
+                    <w:bottom w:type="dxa" w:w="110"/>
+                    <w:right w:type="dxa" w:w="160"/>
+                  </w:tcMar>
+                </w:tcPr>
+                <w:p>
+                  <w:pPr>
+                    <w:spacing w:after="0" w:before="0" w:line="276"/>
+                  </w:pPr>
+                  <w:r>
+                    <w:rPr>
+                      <w:rFonts w:ascii="Arial" w:cs="Arial" w:eastAsia="Arial" w:hAnsi="Arial"/>
+                      <w:b/>
+                      <w:bCs/>
+                      <w:color w:val="0B2E4F"/>
+                      <w:sz w:val="18"/>
+                      <w:szCs w:val="18"/>
+                    </w:rPr>
+                    <w:t xml:space="preserve">Autor o página</w:t>
+                  </w:r>
+                </w:p>
+              </w:tc>
+              <w:tc>
+                <w:tcPr>
+                  <w:tcW w:type="dxa" w:w="6918"/>
+                  <w:tcBorders>
+                    <w:top w:val="single" w:color="93C5FD" w:sz="6"/>
+                    <w:left w:val="single" w:color="93C5FD" w:sz="6"/>
+                    <w:bottom w:val="single" w:color="93C5FD" w:sz="6"/>
+                    <w:right w:val="single" w:color="93C5FD" w:sz="6"/>
                   </w:tcBorders>
                   <w:shd w:fill="F8FBFF" w:color="auto" w:val="clear"/>
                   <w:tcMar>
-                    <w:top w:type="dxa" w:w="80"/>
-                    <w:left w:type="dxa" w:w="140"/>
-                    <w:bottom w:type="dxa" w:w="80"/>
-                    <w:right w:type="dxa" w:w="140"/>
-                  </w:tcMar>
-                </w:tcPr>
-                <w:p>
-                  <w:pPr>
-                    <w:spacing w:after="0" w:before="0" w:line="420"/>
+                    <w:top w:type="dxa" w:w="110"/>
+                    <w:left w:type="dxa" w:w="160"/>
+                    <w:bottom w:type="dxa" w:w="110"/>
+                    <w:right w:type="dxa" w:w="160"/>
+                  </w:tcMar>
+                </w:tcPr>
+                <w:p>
+                  <w:pPr>
+                    <w:spacing w:after="0" w:before="0" w:line="300"/>
+                  </w:pPr>
+                  <w:r>
+                    <w:rPr>
+                      <w:rFonts w:ascii="Arial" w:cs="Arial" w:eastAsia="Arial" w:hAnsi="Arial"/>
+                      <w:color w:val="1E293B"/>
+                      <w:sz w:val="21"/>
+                      <w:szCs w:val="21"/>
+                    </w:rPr>
+                    <w:t xml:space="preserve"> </w:t>
+                  </w:r>
+                </w:p>
+              </w:tc>
+            </w:tr>
+            <w:tr>
+              <w:tc>
+                <w:tcPr>
+                  <w:tcW w:type="dxa" w:w="2400"/>
+                  <w:tcBorders>
+                    <w:top w:val="single" w:color="93C5FD" w:sz="6"/>
+                    <w:left w:val="single" w:color="93C5FD" w:sz="6"/>
+                    <w:bottom w:val="single" w:color="93C5FD" w:sz="6"/>
+                    <w:right w:val="single" w:color="93C5FD" w:sz="6"/>
+                  </w:tcBorders>
+                  <w:shd w:fill="E7F2FA" w:color="auto" w:val="clear"/>
+                  <w:tcMar>
+                    <w:top w:type="dxa" w:w="110"/>
+                    <w:left w:type="dxa" w:w="160"/>
+                    <w:bottom w:type="dxa" w:w="110"/>
+                    <w:right w:type="dxa" w:w="160"/>
+                  </w:tcMar>
+                </w:tcPr>
+                <w:p>
+                  <w:pPr>
+                    <w:spacing w:after="0" w:before="0" w:line="276"/>
+                  </w:pPr>
+                  <w:r>
+                    <w:rPr>
+                      <w:rFonts w:ascii="Arial" w:cs="Arial" w:eastAsia="Arial" w:hAnsi="Arial"/>
+                      <w:b/>
+                      <w:bCs/>
+                      <w:color w:val="0B2E4F"/>
+                      <w:sz w:val="18"/>
+                      <w:szCs w:val="18"/>
+                    </w:rPr>
+                    <w:t xml:space="preserve">Año</w:t>
+                  </w:r>
+                </w:p>
+              </w:tc>
+              <w:tc>
+                <w:tcPr>
+                  <w:tcW w:type="dxa" w:w="6918"/>
+                  <w:tcBorders>
+                    <w:top w:val="single" w:color="93C5FD" w:sz="6"/>
+                    <w:left w:val="single" w:color="93C5FD" w:sz="6"/>
+                    <w:bottom w:val="single" w:color="93C5FD" w:sz="6"/>
+                    <w:right w:val="single" w:color="93C5FD" w:sz="6"/>
+                  </w:tcBorders>
+                  <w:shd w:fill="F8FBFF" w:color="auto" w:val="clear"/>
+                  <w:tcMar>
+                    <w:top w:type="dxa" w:w="110"/>
+                    <w:left w:type="dxa" w:w="160"/>
+                    <w:bottom w:type="dxa" w:w="110"/>
+                    <w:right w:type="dxa" w:w="160"/>
+                  </w:tcMar>
+                </w:tcPr>
+                <w:p>
+                  <w:pPr>
+                    <w:spacing w:after="0" w:before="0" w:line="300"/>
+                  </w:pPr>
+                  <w:r>
+                    <w:rPr>
+                      <w:rFonts w:ascii="Arial" w:cs="Arial" w:eastAsia="Arial" w:hAnsi="Arial"/>
+                      <w:color w:val="1E293B"/>
+                      <w:sz w:val="21"/>
+                      <w:szCs w:val="21"/>
+                    </w:rPr>
+                    <w:t xml:space="preserve"> </w:t>
+                  </w:r>
+                </w:p>
+              </w:tc>
+            </w:tr>
+            <w:tr>
+              <w:tc>
+                <w:tcPr>
+                  <w:tcW w:type="dxa" w:w="2400"/>
+                  <w:tcBorders>
+                    <w:top w:val="single" w:color="93C5FD" w:sz="6"/>
+                    <w:left w:val="single" w:color="93C5FD" w:sz="6"/>
+                    <w:bottom w:val="single" w:color="93C5FD" w:sz="6"/>
+                    <w:right w:val="single" w:color="93C5FD" w:sz="6"/>
+                  </w:tcBorders>
+                  <w:shd w:fill="E7F2FA" w:color="auto" w:val="clear"/>
+                  <w:tcMar>
+                    <w:top w:type="dxa" w:w="110"/>
+                    <w:left w:type="dxa" w:w="160"/>
+                    <w:bottom w:type="dxa" w:w="110"/>
+                    <w:right w:type="dxa" w:w="160"/>
+                  </w:tcMar>
+                </w:tcPr>
+                <w:p>
+                  <w:pPr>
+                    <w:spacing w:after="0" w:before="0" w:line="276"/>
+                  </w:pPr>
+                  <w:r>
+                    <w:rPr>
+                      <w:rFonts w:ascii="Arial" w:cs="Arial" w:eastAsia="Arial" w:hAnsi="Arial"/>
+                      <w:b/>
+                      <w:bCs/>
+                      <w:color w:val="0B2E4F"/>
+                      <w:sz w:val="18"/>
+                      <w:szCs w:val="18"/>
+                    </w:rPr>
+                    <w:t xml:space="preserve">Tema</w:t>
+                  </w:r>
+                </w:p>
+              </w:tc>
+              <w:tc>
+                <w:tcPr>
+                  <w:tcW w:type="dxa" w:w="6918"/>
+                  <w:tcBorders>
+                    <w:top w:val="single" w:color="93C5FD" w:sz="6"/>
+                    <w:left w:val="single" w:color="93C5FD" w:sz="6"/>
+                    <w:bottom w:val="single" w:color="93C5FD" w:sz="6"/>
+                    <w:right w:val="single" w:color="93C5FD" w:sz="6"/>
+                  </w:tcBorders>
+                  <w:shd w:fill="F8FBFF" w:color="auto" w:val="clear"/>
+                  <w:tcMar>
+                    <w:top w:type="dxa" w:w="110"/>
+                    <w:left w:type="dxa" w:w="160"/>
+                    <w:bottom w:type="dxa" w:w="110"/>
+                    <w:right w:type="dxa" w:w="160"/>
+                  </w:tcMar>
+                </w:tcPr>
+                <w:p>
+                  <w:pPr>
+                    <w:spacing w:after="0" w:before="0" w:line="300"/>
+                  </w:pPr>
+                  <w:r>
+                    <w:rPr>
+                      <w:rFonts w:ascii="Arial" w:cs="Arial" w:eastAsia="Arial" w:hAnsi="Arial"/>
+                      <w:color w:val="1E293B"/>
+                      <w:sz w:val="21"/>
+                      <w:szCs w:val="21"/>
+                    </w:rPr>
+                    <w:t xml:space="preserve"> </w:t>
+                  </w:r>
+                </w:p>
+              </w:tc>
+            </w:tr>
+            <w:tr>
+              <w:tc>
+                <w:tcPr>
+                  <w:tcW w:type="dxa" w:w="2400"/>
+                  <w:tcBorders>
+                    <w:top w:val="single" w:color="93C5FD" w:sz="6"/>
+                    <w:left w:val="single" w:color="93C5FD" w:sz="6"/>
+                    <w:bottom w:val="single" w:color="93C5FD" w:sz="6"/>
+                    <w:right w:val="single" w:color="93C5FD" w:sz="6"/>
+                  </w:tcBorders>
+                  <w:shd w:fill="E7F2FA" w:color="auto" w:val="clear"/>
+                  <w:tcMar>
+                    <w:top w:type="dxa" w:w="110"/>
+                    <w:left w:type="dxa" w:w="160"/>
+                    <w:bottom w:type="dxa" w:w="110"/>
+                    <w:right w:type="dxa" w:w="160"/>
+                  </w:tcMar>
+                </w:tcPr>
+                <w:p>
+                  <w:pPr>
+                    <w:spacing w:after="0" w:before="0" w:line="276"/>
+                  </w:pPr>
+                  <w:r>
+                    <w:rPr>
+                      <w:rFonts w:ascii="Arial" w:cs="Arial" w:eastAsia="Arial" w:hAnsi="Arial"/>
+                      <w:b/>
+                      <w:bCs/>
+                      <w:color w:val="0B2E4F"/>
+                      <w:sz w:val="18"/>
+                      <w:szCs w:val="18"/>
+                    </w:rPr>
+                    <w:t xml:space="preserve">Link</w:t>
+                  </w:r>
+                </w:p>
+              </w:tc>
+              <w:tc>
+                <w:tcPr>
+                  <w:tcW w:type="dxa" w:w="6918"/>
+                  <w:tcBorders>
+                    <w:top w:val="single" w:color="93C5FD" w:sz="6"/>
+                    <w:left w:val="single" w:color="93C5FD" w:sz="6"/>
+                    <w:bottom w:val="single" w:color="93C5FD" w:sz="6"/>
+                    <w:right w:val="single" w:color="93C5FD" w:sz="6"/>
+                  </w:tcBorders>
+                  <w:shd w:fill="F8FBFF" w:color="auto" w:val="clear"/>
+                  <w:tcMar>
+                    <w:top w:type="dxa" w:w="110"/>
+                    <w:left w:type="dxa" w:w="160"/>
+                    <w:bottom w:type="dxa" w:w="110"/>
+                    <w:right w:type="dxa" w:w="160"/>
+                  </w:tcMar>
+                </w:tcPr>
+                <w:p>
+                  <w:pPr>
+                    <w:spacing w:after="0" w:before="0" w:line="300"/>
                   </w:pPr>
                   <w:r>
                     <w:rPr>
@@ -3101,7 +3324,7 @@
           </w:tbl>
           <w:p>
             <w:pPr>
-              <w:spacing w:after="60" w:before="0" w:line="276"/>
+              <w:spacing w:after="80" w:before="0" w:line="276"/>
             </w:pPr>
             <w:r>
               <w:rPr>
@@ -3142,29 +3365,268 @@
               </w:tblBorders>
             </w:tblPr>
             <w:tblGrid>
-              <w:gridCol w:w="9318"/>
+              <w:gridCol w:w="2400"/>
+              <w:gridCol w:w="6918"/>
             </w:tblGrid>
             <w:tr>
               <w:tc>
                 <w:tcPr>
-                  <w:tcW w:type="dxa" w:w="9318"/>
-                  <w:tcBorders>
-                    <w:top w:val="single" w:color="93C5FD" w:sz="8"/>
-                    <w:left w:val="single" w:color="93C5FD" w:sz="8"/>
-                    <w:bottom w:val="single" w:color="93C5FD" w:sz="8"/>
-                    <w:right w:val="single" w:color="93C5FD" w:sz="8"/>
+                  <w:tcW w:type="dxa" w:w="2400"/>
+                  <w:tcBorders>
+                    <w:top w:val="single" w:color="93C5FD" w:sz="6"/>
+                    <w:left w:val="single" w:color="93C5FD" w:sz="6"/>
+                    <w:bottom w:val="single" w:color="93C5FD" w:sz="6"/>
+                    <w:right w:val="single" w:color="93C5FD" w:sz="6"/>
+                  </w:tcBorders>
+                  <w:shd w:fill="E7F2FA" w:color="auto" w:val="clear"/>
+                  <w:tcMar>
+                    <w:top w:type="dxa" w:w="110"/>
+                    <w:left w:type="dxa" w:w="160"/>
+                    <w:bottom w:type="dxa" w:w="110"/>
+                    <w:right w:type="dxa" w:w="160"/>
+                  </w:tcMar>
+                </w:tcPr>
+                <w:p>
+                  <w:pPr>
+                    <w:spacing w:after="0" w:before="0" w:line="276"/>
+                  </w:pPr>
+                  <w:r>
+                    <w:rPr>
+                      <w:rFonts w:ascii="Arial" w:cs="Arial" w:eastAsia="Arial" w:hAnsi="Arial"/>
+                      <w:b/>
+                      <w:bCs/>
+                      <w:color w:val="0B2E4F"/>
+                      <w:sz w:val="18"/>
+                      <w:szCs w:val="18"/>
+                    </w:rPr>
+                    <w:t xml:space="preserve">Autor o página</w:t>
+                  </w:r>
+                </w:p>
+              </w:tc>
+              <w:tc>
+                <w:tcPr>
+                  <w:tcW w:type="dxa" w:w="6918"/>
+                  <w:tcBorders>
+                    <w:top w:val="single" w:color="93C5FD" w:sz="6"/>
+                    <w:left w:val="single" w:color="93C5FD" w:sz="6"/>
+                    <w:bottom w:val="single" w:color="93C5FD" w:sz="6"/>
+                    <w:right w:val="single" w:color="93C5FD" w:sz="6"/>
                   </w:tcBorders>
                   <w:shd w:fill="F8FBFF" w:color="auto" w:val="clear"/>
                   <w:tcMar>
-                    <w:top w:type="dxa" w:w="80"/>
-                    <w:left w:type="dxa" w:w="140"/>
-                    <w:bottom w:type="dxa" w:w="80"/>
-                    <w:right w:type="dxa" w:w="140"/>
-                  </w:tcMar>
-                </w:tcPr>
-                <w:p>
-                  <w:pPr>
-                    <w:spacing w:after="0" w:before="0" w:line="420"/>
+                    <w:top w:type="dxa" w:w="110"/>
+                    <w:left w:type="dxa" w:w="160"/>
+                    <w:bottom w:type="dxa" w:w="110"/>
+                    <w:right w:type="dxa" w:w="160"/>
+                  </w:tcMar>
+                </w:tcPr>
+                <w:p>
+                  <w:pPr>
+                    <w:spacing w:after="0" w:before="0" w:line="300"/>
+                  </w:pPr>
+                  <w:r>
+                    <w:rPr>
+                      <w:rFonts w:ascii="Arial" w:cs="Arial" w:eastAsia="Arial" w:hAnsi="Arial"/>
+                      <w:color w:val="1E293B"/>
+                      <w:sz w:val="21"/>
+                      <w:szCs w:val="21"/>
+                    </w:rPr>
+                    <w:t xml:space="preserve"> </w:t>
+                  </w:r>
+                </w:p>
+              </w:tc>
+            </w:tr>
+            <w:tr>
+              <w:tc>
+                <w:tcPr>
+                  <w:tcW w:type="dxa" w:w="2400"/>
+                  <w:tcBorders>
+                    <w:top w:val="single" w:color="93C5FD" w:sz="6"/>
+                    <w:left w:val="single" w:color="93C5FD" w:sz="6"/>
+                    <w:bottom w:val="single" w:color="93C5FD" w:sz="6"/>
+                    <w:right w:val="single" w:color="93C5FD" w:sz="6"/>
+                  </w:tcBorders>
+                  <w:shd w:fill="E7F2FA" w:color="auto" w:val="clear"/>
+                  <w:tcMar>
+                    <w:top w:type="dxa" w:w="110"/>
+                    <w:left w:type="dxa" w:w="160"/>
+                    <w:bottom w:type="dxa" w:w="110"/>
+                    <w:right w:type="dxa" w:w="160"/>
+                  </w:tcMar>
+                </w:tcPr>
+                <w:p>
+                  <w:pPr>
+                    <w:spacing w:after="0" w:before="0" w:line="276"/>
+                  </w:pPr>
+                  <w:r>
+                    <w:rPr>
+                      <w:rFonts w:ascii="Arial" w:cs="Arial" w:eastAsia="Arial" w:hAnsi="Arial"/>
+                      <w:b/>
+                      <w:bCs/>
+                      <w:color w:val="0B2E4F"/>
+                      <w:sz w:val="18"/>
+                      <w:szCs w:val="18"/>
+                    </w:rPr>
+                    <w:t xml:space="preserve">Año</w:t>
+                  </w:r>
+                </w:p>
+              </w:tc>
+              <w:tc>
+                <w:tcPr>
+                  <w:tcW w:type="dxa" w:w="6918"/>
+                  <w:tcBorders>
+                    <w:top w:val="single" w:color="93C5FD" w:sz="6"/>
+                    <w:left w:val="single" w:color="93C5FD" w:sz="6"/>
+                    <w:bottom w:val="single" w:color="93C5FD" w:sz="6"/>
+                    <w:right w:val="single" w:color="93C5FD" w:sz="6"/>
+                  </w:tcBorders>
+                  <w:shd w:fill="F8FBFF" w:color="auto" w:val="clear"/>
+                  <w:tcMar>
+                    <w:top w:type="dxa" w:w="110"/>
+                    <w:left w:type="dxa" w:w="160"/>
+                    <w:bottom w:type="dxa" w:w="110"/>
+                    <w:right w:type="dxa" w:w="160"/>
+                  </w:tcMar>
+                </w:tcPr>
+                <w:p>
+                  <w:pPr>
+                    <w:spacing w:after="0" w:before="0" w:line="300"/>
+                  </w:pPr>
+                  <w:r>
+                    <w:rPr>
+                      <w:rFonts w:ascii="Arial" w:cs="Arial" w:eastAsia="Arial" w:hAnsi="Arial"/>
+                      <w:color w:val="1E293B"/>
+                      <w:sz w:val="21"/>
+                      <w:szCs w:val="21"/>
+                    </w:rPr>
+                    <w:t xml:space="preserve"> </w:t>
+                  </w:r>
+                </w:p>
+              </w:tc>
+            </w:tr>
+            <w:tr>
+              <w:tc>
+                <w:tcPr>
+                  <w:tcW w:type="dxa" w:w="2400"/>
+                  <w:tcBorders>
+                    <w:top w:val="single" w:color="93C5FD" w:sz="6"/>
+                    <w:left w:val="single" w:color="93C5FD" w:sz="6"/>
+                    <w:bottom w:val="single" w:color="93C5FD" w:sz="6"/>
+                    <w:right w:val="single" w:color="93C5FD" w:sz="6"/>
+                  </w:tcBorders>
+                  <w:shd w:fill="E7F2FA" w:color="auto" w:val="clear"/>
+                  <w:tcMar>
+                    <w:top w:type="dxa" w:w="110"/>
+                    <w:left w:type="dxa" w:w="160"/>
+                    <w:bottom w:type="dxa" w:w="110"/>
+                    <w:right w:type="dxa" w:w="160"/>
+                  </w:tcMar>
+                </w:tcPr>
+                <w:p>
+                  <w:pPr>
+                    <w:spacing w:after="0" w:before="0" w:line="276"/>
+                  </w:pPr>
+                  <w:r>
+                    <w:rPr>
+                      <w:rFonts w:ascii="Arial" w:cs="Arial" w:eastAsia="Arial" w:hAnsi="Arial"/>
+                      <w:b/>
+                      <w:bCs/>
+                      <w:color w:val="0B2E4F"/>
+                      <w:sz w:val="18"/>
+                      <w:szCs w:val="18"/>
+                    </w:rPr>
+                    <w:t xml:space="preserve">Tema</w:t>
+                  </w:r>
+                </w:p>
+              </w:tc>
+              <w:tc>
+                <w:tcPr>
+                  <w:tcW w:type="dxa" w:w="6918"/>
+                  <w:tcBorders>
+                    <w:top w:val="single" w:color="93C5FD" w:sz="6"/>
+                    <w:left w:val="single" w:color="93C5FD" w:sz="6"/>
+                    <w:bottom w:val="single" w:color="93C5FD" w:sz="6"/>
+                    <w:right w:val="single" w:color="93C5FD" w:sz="6"/>
+                  </w:tcBorders>
+                  <w:shd w:fill="F8FBFF" w:color="auto" w:val="clear"/>
+                  <w:tcMar>
+                    <w:top w:type="dxa" w:w="110"/>
+                    <w:left w:type="dxa" w:w="160"/>
+                    <w:bottom w:type="dxa" w:w="110"/>
+                    <w:right w:type="dxa" w:w="160"/>
+                  </w:tcMar>
+                </w:tcPr>
+                <w:p>
+                  <w:pPr>
+                    <w:spacing w:after="0" w:before="0" w:line="300"/>
+                  </w:pPr>
+                  <w:r>
+                    <w:rPr>
+                      <w:rFonts w:ascii="Arial" w:cs="Arial" w:eastAsia="Arial" w:hAnsi="Arial"/>
+                      <w:color w:val="1E293B"/>
+                      <w:sz w:val="21"/>
+                      <w:szCs w:val="21"/>
+                    </w:rPr>
+                    <w:t xml:space="preserve"> </w:t>
+                  </w:r>
+                </w:p>
+              </w:tc>
+            </w:tr>
+            <w:tr>
+              <w:tc>
+                <w:tcPr>
+                  <w:tcW w:type="dxa" w:w="2400"/>
+                  <w:tcBorders>
+                    <w:top w:val="single" w:color="93C5FD" w:sz="6"/>
+                    <w:left w:val="single" w:color="93C5FD" w:sz="6"/>
+                    <w:bottom w:val="single" w:color="93C5FD" w:sz="6"/>
+                    <w:right w:val="single" w:color="93C5FD" w:sz="6"/>
+                  </w:tcBorders>
+                  <w:shd w:fill="E7F2FA" w:color="auto" w:val="clear"/>
+                  <w:tcMar>
+                    <w:top w:type="dxa" w:w="110"/>
+                    <w:left w:type="dxa" w:w="160"/>
+                    <w:bottom w:type="dxa" w:w="110"/>
+                    <w:right w:type="dxa" w:w="160"/>
+                  </w:tcMar>
+                </w:tcPr>
+                <w:p>
+                  <w:pPr>
+                    <w:spacing w:after="0" w:before="0" w:line="276"/>
+                  </w:pPr>
+                  <w:r>
+                    <w:rPr>
+                      <w:rFonts w:ascii="Arial" w:cs="Arial" w:eastAsia="Arial" w:hAnsi="Arial"/>
+                      <w:b/>
+                      <w:bCs/>
+                      <w:color w:val="0B2E4F"/>
+                      <w:sz w:val="18"/>
+                      <w:szCs w:val="18"/>
+                    </w:rPr>
+                    <w:t xml:space="preserve">Link</w:t>
+                  </w:r>
+                </w:p>
+              </w:tc>
+              <w:tc>
+                <w:tcPr>
+                  <w:tcW w:type="dxa" w:w="6918"/>
+                  <w:tcBorders>
+                    <w:top w:val="single" w:color="93C5FD" w:sz="6"/>
+                    <w:left w:val="single" w:color="93C5FD" w:sz="6"/>
+                    <w:bottom w:val="single" w:color="93C5FD" w:sz="6"/>
+                    <w:right w:val="single" w:color="93C5FD" w:sz="6"/>
+                  </w:tcBorders>
+                  <w:shd w:fill="F8FBFF" w:color="auto" w:val="clear"/>
+                  <w:tcMar>
+                    <w:top w:type="dxa" w:w="110"/>
+                    <w:left w:type="dxa" w:w="160"/>
+                    <w:bottom w:type="dxa" w:w="110"/>
+                    <w:right w:type="dxa" w:w="160"/>
+                  </w:tcMar>
+                </w:tcPr>
+                <w:p>
+                  <w:pPr>
+                    <w:spacing w:after="0" w:before="0" w:line="300"/>
                   </w:pPr>
                   <w:r>
                     <w:rPr>
@@ -3181,7 +3643,7 @@
           </w:tbl>
           <w:p>
             <w:pPr>
-              <w:spacing w:after="60" w:before="0" w:line="276"/>
+              <w:spacing w:after="80" w:before="0" w:line="276"/>
             </w:pPr>
             <w:r>
               <w:rPr>
@@ -3222,29 +3684,268 @@
               </w:tblBorders>
             </w:tblPr>
             <w:tblGrid>
-              <w:gridCol w:w="9318"/>
+              <w:gridCol w:w="2400"/>
+              <w:gridCol w:w="6918"/>
             </w:tblGrid>
             <w:tr>
               <w:tc>
                 <w:tcPr>
-                  <w:tcW w:type="dxa" w:w="9318"/>
-                  <w:tcBorders>
-                    <w:top w:val="single" w:color="93C5FD" w:sz="8"/>
-                    <w:left w:val="single" w:color="93C5FD" w:sz="8"/>
-                    <w:bottom w:val="single" w:color="93C5FD" w:sz="8"/>
-                    <w:right w:val="single" w:color="93C5FD" w:sz="8"/>
+                  <w:tcW w:type="dxa" w:w="2400"/>
+                  <w:tcBorders>
+                    <w:top w:val="single" w:color="93C5FD" w:sz="6"/>
+                    <w:left w:val="single" w:color="93C5FD" w:sz="6"/>
+                    <w:bottom w:val="single" w:color="93C5FD" w:sz="6"/>
+                    <w:right w:val="single" w:color="93C5FD" w:sz="6"/>
+                  </w:tcBorders>
+                  <w:shd w:fill="E7F2FA" w:color="auto" w:val="clear"/>
+                  <w:tcMar>
+                    <w:top w:type="dxa" w:w="110"/>
+                    <w:left w:type="dxa" w:w="160"/>
+                    <w:bottom w:type="dxa" w:w="110"/>
+                    <w:right w:type="dxa" w:w="160"/>
+                  </w:tcMar>
+                </w:tcPr>
+                <w:p>
+                  <w:pPr>
+                    <w:spacing w:after="0" w:before="0" w:line="276"/>
+                  </w:pPr>
+                  <w:r>
+                    <w:rPr>
+                      <w:rFonts w:ascii="Arial" w:cs="Arial" w:eastAsia="Arial" w:hAnsi="Arial"/>
+                      <w:b/>
+                      <w:bCs/>
+                      <w:color w:val="0B2E4F"/>
+                      <w:sz w:val="18"/>
+                      <w:szCs w:val="18"/>
+                    </w:rPr>
+                    <w:t xml:space="preserve">Autor o página</w:t>
+                  </w:r>
+                </w:p>
+              </w:tc>
+              <w:tc>
+                <w:tcPr>
+                  <w:tcW w:type="dxa" w:w="6918"/>
+                  <w:tcBorders>
+                    <w:top w:val="single" w:color="93C5FD" w:sz="6"/>
+                    <w:left w:val="single" w:color="93C5FD" w:sz="6"/>
+                    <w:bottom w:val="single" w:color="93C5FD" w:sz="6"/>
+                    <w:right w:val="single" w:color="93C5FD" w:sz="6"/>
                   </w:tcBorders>
                   <w:shd w:fill="F8FBFF" w:color="auto" w:val="clear"/>
                   <w:tcMar>
-                    <w:top w:type="dxa" w:w="80"/>
-                    <w:left w:type="dxa" w:w="140"/>
-                    <w:bottom w:type="dxa" w:w="80"/>
-                    <w:right w:type="dxa" w:w="140"/>
-                  </w:tcMar>
-                </w:tcPr>
-                <w:p>
-                  <w:pPr>
-                    <w:spacing w:after="0" w:before="0" w:line="420"/>
+                    <w:top w:type="dxa" w:w="110"/>
+                    <w:left w:type="dxa" w:w="160"/>
+                    <w:bottom w:type="dxa" w:w="110"/>
+                    <w:right w:type="dxa" w:w="160"/>
+                  </w:tcMar>
+                </w:tcPr>
+                <w:p>
+                  <w:pPr>
+                    <w:spacing w:after="0" w:before="0" w:line="300"/>
+                  </w:pPr>
+                  <w:r>
+                    <w:rPr>
+                      <w:rFonts w:ascii="Arial" w:cs="Arial" w:eastAsia="Arial" w:hAnsi="Arial"/>
+                      <w:color w:val="1E293B"/>
+                      <w:sz w:val="21"/>
+                      <w:szCs w:val="21"/>
+                    </w:rPr>
+                    <w:t xml:space="preserve"> </w:t>
+                  </w:r>
+                </w:p>
+              </w:tc>
+            </w:tr>
+            <w:tr>
+              <w:tc>
+                <w:tcPr>
+                  <w:tcW w:type="dxa" w:w="2400"/>
+                  <w:tcBorders>
+                    <w:top w:val="single" w:color="93C5FD" w:sz="6"/>
+                    <w:left w:val="single" w:color="93C5FD" w:sz="6"/>
+                    <w:bottom w:val="single" w:color="93C5FD" w:sz="6"/>
+                    <w:right w:val="single" w:color="93C5FD" w:sz="6"/>
+                  </w:tcBorders>
+                  <w:shd w:fill="E7F2FA" w:color="auto" w:val="clear"/>
+                  <w:tcMar>
+                    <w:top w:type="dxa" w:w="110"/>
+                    <w:left w:type="dxa" w:w="160"/>
+                    <w:bottom w:type="dxa" w:w="110"/>
+                    <w:right w:type="dxa" w:w="160"/>
+                  </w:tcMar>
+                </w:tcPr>
+                <w:p>
+                  <w:pPr>
+                    <w:spacing w:after="0" w:before="0" w:line="276"/>
+                  </w:pPr>
+                  <w:r>
+                    <w:rPr>
+                      <w:rFonts w:ascii="Arial" w:cs="Arial" w:eastAsia="Arial" w:hAnsi="Arial"/>
+                      <w:b/>
+                      <w:bCs/>
+                      <w:color w:val="0B2E4F"/>
+                      <w:sz w:val="18"/>
+                      <w:szCs w:val="18"/>
+                    </w:rPr>
+                    <w:t xml:space="preserve">Año</w:t>
+                  </w:r>
+                </w:p>
+              </w:tc>
+              <w:tc>
+                <w:tcPr>
+                  <w:tcW w:type="dxa" w:w="6918"/>
+                  <w:tcBorders>
+                    <w:top w:val="single" w:color="93C5FD" w:sz="6"/>
+                    <w:left w:val="single" w:color="93C5FD" w:sz="6"/>
+                    <w:bottom w:val="single" w:color="93C5FD" w:sz="6"/>
+                    <w:right w:val="single" w:color="93C5FD" w:sz="6"/>
+                  </w:tcBorders>
+                  <w:shd w:fill="F8FBFF" w:color="auto" w:val="clear"/>
+                  <w:tcMar>
+                    <w:top w:type="dxa" w:w="110"/>
+                    <w:left w:type="dxa" w:w="160"/>
+                    <w:bottom w:type="dxa" w:w="110"/>
+                    <w:right w:type="dxa" w:w="160"/>
+                  </w:tcMar>
+                </w:tcPr>
+                <w:p>
+                  <w:pPr>
+                    <w:spacing w:after="0" w:before="0" w:line="300"/>
+                  </w:pPr>
+                  <w:r>
+                    <w:rPr>
+                      <w:rFonts w:ascii="Arial" w:cs="Arial" w:eastAsia="Arial" w:hAnsi="Arial"/>
+                      <w:color w:val="1E293B"/>
+                      <w:sz w:val="21"/>
+                      <w:szCs w:val="21"/>
+                    </w:rPr>
+                    <w:t xml:space="preserve"> </w:t>
+                  </w:r>
+                </w:p>
+              </w:tc>
+            </w:tr>
+            <w:tr>
+              <w:tc>
+                <w:tcPr>
+                  <w:tcW w:type="dxa" w:w="2400"/>
+                  <w:tcBorders>
+                    <w:top w:val="single" w:color="93C5FD" w:sz="6"/>
+                    <w:left w:val="single" w:color="93C5FD" w:sz="6"/>
+                    <w:bottom w:val="single" w:color="93C5FD" w:sz="6"/>
+                    <w:right w:val="single" w:color="93C5FD" w:sz="6"/>
+                  </w:tcBorders>
+                  <w:shd w:fill="E7F2FA" w:color="auto" w:val="clear"/>
+                  <w:tcMar>
+                    <w:top w:type="dxa" w:w="110"/>
+                    <w:left w:type="dxa" w:w="160"/>
+                    <w:bottom w:type="dxa" w:w="110"/>
+                    <w:right w:type="dxa" w:w="160"/>
+                  </w:tcMar>
+                </w:tcPr>
+                <w:p>
+                  <w:pPr>
+                    <w:spacing w:after="0" w:before="0" w:line="276"/>
+                  </w:pPr>
+                  <w:r>
+                    <w:rPr>
+                      <w:rFonts w:ascii="Arial" w:cs="Arial" w:eastAsia="Arial" w:hAnsi="Arial"/>
+                      <w:b/>
+                      <w:bCs/>
+                      <w:color w:val="0B2E4F"/>
+                      <w:sz w:val="18"/>
+                      <w:szCs w:val="18"/>
+                    </w:rPr>
+                    <w:t xml:space="preserve">Tema</w:t>
+                  </w:r>
+                </w:p>
+              </w:tc>
+              <w:tc>
+                <w:tcPr>
+                  <w:tcW w:type="dxa" w:w="6918"/>
+                  <w:tcBorders>
+                    <w:top w:val="single" w:color="93C5FD" w:sz="6"/>
+                    <w:left w:val="single" w:color="93C5FD" w:sz="6"/>
+                    <w:bottom w:val="single" w:color="93C5FD" w:sz="6"/>
+                    <w:right w:val="single" w:color="93C5FD" w:sz="6"/>
+                  </w:tcBorders>
+                  <w:shd w:fill="F8FBFF" w:color="auto" w:val="clear"/>
+                  <w:tcMar>
+                    <w:top w:type="dxa" w:w="110"/>
+                    <w:left w:type="dxa" w:w="160"/>
+                    <w:bottom w:type="dxa" w:w="110"/>
+                    <w:right w:type="dxa" w:w="160"/>
+                  </w:tcMar>
+                </w:tcPr>
+                <w:p>
+                  <w:pPr>
+                    <w:spacing w:after="0" w:before="0" w:line="300"/>
+                  </w:pPr>
+                  <w:r>
+                    <w:rPr>
+                      <w:rFonts w:ascii="Arial" w:cs="Arial" w:eastAsia="Arial" w:hAnsi="Arial"/>
+                      <w:color w:val="1E293B"/>
+                      <w:sz w:val="21"/>
+                      <w:szCs w:val="21"/>
+                    </w:rPr>
+                    <w:t xml:space="preserve"> </w:t>
+                  </w:r>
+                </w:p>
+              </w:tc>
+            </w:tr>
+            <w:tr>
+              <w:tc>
+                <w:tcPr>
+                  <w:tcW w:type="dxa" w:w="2400"/>
+                  <w:tcBorders>
+                    <w:top w:val="single" w:color="93C5FD" w:sz="6"/>
+                    <w:left w:val="single" w:color="93C5FD" w:sz="6"/>
+                    <w:bottom w:val="single" w:color="93C5FD" w:sz="6"/>
+                    <w:right w:val="single" w:color="93C5FD" w:sz="6"/>
+                  </w:tcBorders>
+                  <w:shd w:fill="E7F2FA" w:color="auto" w:val="clear"/>
+                  <w:tcMar>
+                    <w:top w:type="dxa" w:w="110"/>
+                    <w:left w:type="dxa" w:w="160"/>
+                    <w:bottom w:type="dxa" w:w="110"/>
+                    <w:right w:type="dxa" w:w="160"/>
+                  </w:tcMar>
+                </w:tcPr>
+                <w:p>
+                  <w:pPr>
+                    <w:spacing w:after="0" w:before="0" w:line="276"/>
+                  </w:pPr>
+                  <w:r>
+                    <w:rPr>
+                      <w:rFonts w:ascii="Arial" w:cs="Arial" w:eastAsia="Arial" w:hAnsi="Arial"/>
+                      <w:b/>
+                      <w:bCs/>
+                      <w:color w:val="0B2E4F"/>
+                      <w:sz w:val="18"/>
+                      <w:szCs w:val="18"/>
+                    </w:rPr>
+                    <w:t xml:space="preserve">Link</w:t>
+                  </w:r>
+                </w:p>
+              </w:tc>
+              <w:tc>
+                <w:tcPr>
+                  <w:tcW w:type="dxa" w:w="6918"/>
+                  <w:tcBorders>
+                    <w:top w:val="single" w:color="93C5FD" w:sz="6"/>
+                    <w:left w:val="single" w:color="93C5FD" w:sz="6"/>
+                    <w:bottom w:val="single" w:color="93C5FD" w:sz="6"/>
+                    <w:right w:val="single" w:color="93C5FD" w:sz="6"/>
+                  </w:tcBorders>
+                  <w:shd w:fill="F8FBFF" w:color="auto" w:val="clear"/>
+                  <w:tcMar>
+                    <w:top w:type="dxa" w:w="110"/>
+                    <w:left w:type="dxa" w:w="160"/>
+                    <w:bottom w:type="dxa" w:w="110"/>
+                    <w:right w:type="dxa" w:w="160"/>
+                  </w:tcMar>
+                </w:tcPr>
+                <w:p>
+                  <w:pPr>
+                    <w:spacing w:after="0" w:before="0" w:line="300"/>
                   </w:pPr>
                   <w:r>
                     <w:rPr>
@@ -3261,7 +3962,7 @@
           </w:tbl>
           <w:p>
             <w:pPr>
-              <w:spacing w:after="60" w:before="0" w:line="276"/>
+              <w:spacing w:after="80" w:before="0" w:line="276"/>
             </w:pPr>
             <w:r>
               <w:rPr>

</xml_diff>